<commit_message>
demo: exercise the new Office previews
Richer sample xlsx and docx so the readers have something to chew on,
and tile copy that no longer claims browsers can't preview them.

Loads the library from src/ rather than dist/, so the demo runs from a
clean checkout without a build step.

Co-Authored-By: Claude Opus 5 <noreply@anthropic.com>
</commit_message>
<xml_diff>
--- a/demo/assets/supplier-agreement.docx
+++ b/demo/assets/supplier-agreement.docx
@@ -7,12 +7,30 @@
         <w:pStyle w:val="Title"/>
       </w:pPr>
       <w:r>
-        <w:t>Supplier agreement — draft</w:t>
+        <w:t>Supplier agreement — revision C</w:t>
       </w:r>
     </w:p>
     <w:p>
       <w:r>
-        <w:t>Sample document generated for the Filedeck demo.</w:t>
+        <w:t xml:space="preserve">This agreement is made between </w:t>
+      </w:r>
+      <w:r>
+        <w:rPr>
+          <w:b/>
+        </w:rPr>
+        <w:t>Hardik CNC Automation</w:t>
+      </w:r>
+      <w:r>
+        <w:t xml:space="preserve"> and the supplier named below. Terms are </w:t>
+      </w:r>
+      <w:r>
+        <w:rPr>
+          <w:i/>
+        </w:rPr>
+        <w:t>indicative</w:t>
+      </w:r>
+      <w:r>
+        <w:t xml:space="preserve"> until countersigned.</w:t>
       </w:r>
     </w:p>
     <w:p>
@@ -20,12 +38,36 @@
         <w:pStyle w:val="Heading1"/>
       </w:pPr>
       <w:r>
-        <w:t>Clause 1</w:t>
+        <w:t>1. Scope of supply</w:t>
       </w:r>
     </w:p>
     <w:p>
       <w:r>
-        <w:t>Placeholder text. No browser renders .docx natively, so this file exercises the file-card path rather than a preview.</w:t>
+        <w:t>The supplier shall provide the following items:</w:t>
+      </w:r>
+    </w:p>
+    <w:p>
+      <w:pPr>
+        <w:pStyle w:val="ListBullet"/>
+      </w:pPr>
+      <w:r>
+        <w:t>Pump housings, cast and machined</w:t>
+      </w:r>
+    </w:p>
+    <w:p>
+      <w:pPr>
+        <w:pStyle w:val="ListBullet"/>
+      </w:pPr>
+      <w:r>
+        <w:t>Impellers, 140 mm</w:t>
+      </w:r>
+    </w:p>
+    <w:p>
+      <w:pPr>
+        <w:pStyle w:val="ListBullet"/>
+      </w:pPr>
+      <w:r>
+        <w:t>Shaft seal kits</w:t>
       </w:r>
     </w:p>
     <w:p>
@@ -33,12 +75,31 @@
         <w:pStyle w:val="Heading1"/>
       </w:pPr>
       <w:r>
-        <w:t>Clause 2</w:t>
+        <w:t>2. Delivery schedule</w:t>
       </w:r>
     </w:p>
     <w:p>
+      <w:pPr>
+        <w:pStyle w:val="ListNumber"/>
+      </w:pPr>
       <w:r>
-        <w:t>Placeholder text. No browser renders .docx natively, so this file exercises the file-card path rather than a preview.</w:t>
+        <w:t>First batch within 21 days</w:t>
+      </w:r>
+    </w:p>
+    <w:p>
+      <w:pPr>
+        <w:pStyle w:val="ListNumber"/>
+      </w:pPr>
+      <w:r>
+        <w:t>Remaining batches monthly</w:t>
+      </w:r>
+    </w:p>
+    <w:p>
+      <w:pPr>
+        <w:pStyle w:val="ListNumber"/>
+      </w:pPr>
+      <w:r>
+        <w:t>Inspection on receipt</w:t>
       </w:r>
     </w:p>
     <w:p>
@@ -46,12 +107,167 @@
         <w:pStyle w:val="Heading1"/>
       </w:pPr>
       <w:r>
-        <w:t>Clause 3</w:t>
+        <w:t>3. Commercial terms</w:t>
+      </w:r>
+    </w:p>
+    <w:tbl>
+      <w:tblPr>
+        <w:tblStyle w:val="TableGrid"/>
+        <w:tblW w:type="auto" w:w="0"/>
+        <w:tblLook w:firstColumn="1" w:firstRow="1" w:lastColumn="0" w:lastRow="0" w:noHBand="0" w:noVBand="1" w:val="04A0"/>
+      </w:tblPr>
+      <w:tblGrid>
+        <w:gridCol w:w="2880"/>
+        <w:gridCol w:w="2880"/>
+        <w:gridCol w:w="2880"/>
+      </w:tblGrid>
+      <w:tr>
+        <w:tc>
+          <w:tcPr>
+            <w:tcW w:type="dxa" w:w="2880"/>
+          </w:tcPr>
+          <w:p>
+            <w:r>
+              <w:t>Item</w:t>
+            </w:r>
+          </w:p>
+        </w:tc>
+        <w:tc>
+          <w:tcPr>
+            <w:tcW w:type="dxa" w:w="2880"/>
+          </w:tcPr>
+          <w:p>
+            <w:r>
+              <w:t>Qty</w:t>
+            </w:r>
+          </w:p>
+        </w:tc>
+        <w:tc>
+          <w:tcPr>
+            <w:tcW w:type="dxa" w:w="2880"/>
+          </w:tcPr>
+          <w:p>
+            <w:r>
+              <w:t>Unit cost</w:t>
+            </w:r>
+          </w:p>
+        </w:tc>
+      </w:tr>
+      <w:tr>
+        <w:tc>
+          <w:tcPr>
+            <w:tcW w:type="dxa" w:w="2880"/>
+          </w:tcPr>
+          <w:p>
+            <w:r>
+              <w:t>HCA-1001</w:t>
+            </w:r>
+          </w:p>
+        </w:tc>
+        <w:tc>
+          <w:tcPr>
+            <w:tcW w:type="dxa" w:w="2880"/>
+          </w:tcPr>
+          <w:p>
+            <w:r>
+              <w:t>12</w:t>
+            </w:r>
+          </w:p>
+        </w:tc>
+        <w:tc>
+          <w:tcPr>
+            <w:tcW w:type="dxa" w:w="2880"/>
+          </w:tcPr>
+          <w:p>
+            <w:r>
+              <w:t>184.50</w:t>
+            </w:r>
+          </w:p>
+        </w:tc>
+      </w:tr>
+      <w:tr>
+        <w:tc>
+          <w:tcPr>
+            <w:tcW w:type="dxa" w:w="2880"/>
+          </w:tcPr>
+          <w:p>
+            <w:r>
+              <w:t>HCA-2140</w:t>
+            </w:r>
+          </w:p>
+        </w:tc>
+        <w:tc>
+          <w:tcPr>
+            <w:tcW w:type="dxa" w:w="2880"/>
+          </w:tcPr>
+          <w:p>
+            <w:r>
+              <w:t>24</w:t>
+            </w:r>
+          </w:p>
+        </w:tc>
+        <w:tc>
+          <w:tcPr>
+            <w:tcW w:type="dxa" w:w="2880"/>
+          </w:tcPr>
+          <w:p>
+            <w:r>
+              <w:t>22.75</w:t>
+            </w:r>
+          </w:p>
+        </w:tc>
+      </w:tr>
+    </w:tbl>
+    <w:p>
+      <w:pPr>
+        <w:pStyle w:val="Heading1"/>
+      </w:pPr>
+      <w:r>
+        <w:t>4. Reference drawing</w:t>
       </w:r>
     </w:p>
     <w:p>
       <w:r>
-        <w:t>Placeholder text. No browser renders .docx natively, so this file exercises the file-card path rather than a preview.</w:t>
+        <w:drawing>
+          <wp:inline xmlns:a="http://schemas.openxmlformats.org/drawingml/2006/main" xmlns:pic="http://schemas.openxmlformats.org/drawingml/2006/picture">
+            <wp:extent cx="2926080" cy="1658112"/>
+            <wp:docPr id="1" name="Picture 1"/>
+            <wp:cNvGraphicFramePr>
+              <a:graphicFrameLocks noChangeAspect="1"/>
+            </wp:cNvGraphicFramePr>
+            <a:graphic>
+              <a:graphicData uri="http://schemas.openxmlformats.org/drawingml/2006/picture">
+                <pic:pic>
+                  <pic:nvPicPr>
+                    <pic:cNvPr id="0" name="fig.png"/>
+                    <pic:cNvPicPr/>
+                  </pic:nvPicPr>
+                  <pic:blipFill>
+                    <a:blip r:embed="rId9"/>
+                    <a:stretch>
+                      <a:fillRect/>
+                    </a:stretch>
+                  </pic:blipFill>
+                  <pic:spPr>
+                    <a:xfrm>
+                      <a:off x="0" y="0"/>
+                      <a:ext cx="2926080" cy="1658112"/>
+                    </a:xfrm>
+                    <a:prstGeom prst="rect"/>
+                  </pic:spPr>
+                </pic:pic>
+              </a:graphicData>
+            </a:graphic>
+          </wp:inline>
+        </w:drawing>
+      </w:r>
+    </w:p>
+    <w:p>
+      <w:pPr>
+        <w:pStyle w:val="IntenseQuote"/>
+      </w:pPr>
+      <w:r>
+        <w:t>All disputes shall be settled under the jurisdiction of Rajkot.</w:t>
       </w:r>
     </w:p>
     <w:sectPr>

</xml_diff>